<commit_message>
Agregar formulario intake en landing, actualizar docs y precios de lanzamiento
- Sección #iniciar con formulario intake integrado (glass morphism, todos los campos obligatorios)
- Nav link "Iniciar" agregado
- Precios actualizados: Starter $79.200, Profesional $224.000, Premium $384.000
- Paquetes de datos en contrato y generador: Analytics Setup, Data Pro, Data Enterprise
- Stablecoins (USDT/USDC/DAI) como medio de pago en contrato
- Formulario standalone actualizado con precios y campos obligatorios
- PDF/DOCX regenerados con mejor formato y sin páginas en blanco
</commit_message>
<xml_diff>
--- a/documentos/contrato-servicios.docx
+++ b/documentos/contrato-servicios.docx
@@ -14,7 +14,7 @@
         </w:rPr>
         <w:t>CONTRATO DE LOCACIÓN DE SERVICIOS</w:t>
         <w:br/>
-        <w:t>DE DESARROLLO WEB</w:t>
+        <w:t>DE DESARROLLO WEB Y DATOS</w:t>
       </w:r>
     </w:p>
     <w:p>
@@ -52,7 +52,7 @@
           <w:i w:val="0"/>
           <w:sz w:val="21"/>
         </w:rPr>
-        <w:t>EL PRESTADOR: Juan Ignacio Barranco, DNI N.° ____________, con domicilio en Maipú, Mendoza, correo electrónico jbarranco.sistemas@gmail.com, teléfono +54 9 261 642-3730, en adelante "EL DESARROLLADOR".</w:t>
+        <w:t>EL PRESTADOR: Juan Ignacio Barranco, DNI N.° ____________, con domicilio en Maipú, Mendoza, correo electrónico jbarranco.sistemas@gmail.com, teléfono +54 9 261 642-3730, en adelante “EL DESARROLLADOR”.</w:t>
       </w:r>
     </w:p>
     <w:p>
@@ -67,7 +67,7 @@
           <w:i w:val="0"/>
           <w:sz w:val="21"/>
         </w:rPr>
-        <w:t>EL COMITENTE: ____________________________________________, DNI/CUIT N.° ____________, con domicilio comercial en ____________________________________________, correo electrónico ________________________, teléfono ________________________, en adelante "EL CLIENTE".</w:t>
+        <w:t>EL COMITENTE: ____________________________________________, DNI/CUIT N.° ____________, con domicilio comercial en ____________________________________________, correo electrónico ________________________, teléfono ________________________, en adelante “EL CLIENTE”.</w:t>
       </w:r>
     </w:p>
     <w:p>
@@ -108,7 +108,7 @@
           <w:i w:val="0"/>
           <w:sz w:val="21"/>
         </w:rPr>
-        <w:t>El Desarrollador se compromete a diseñar, desarrollar y entregar al Cliente un sitio web profesional según las especificaciones detalladas en el Anexo A — Alcance del proyecto, que forma parte integrante de este contrato.</w:t>
+        <w:t>El Desarrollador se compromete a diseñar, desarrollar y entregar al Cliente un sitio web profesional y/o servicios de datos según las especificaciones detalladas en el Anexo A — Alcance del proyecto, que forma parte integrante de este contrato.</w:t>
       </w:r>
     </w:p>
     <w:p>
@@ -123,7 +123,7 @@
           <w:i w:val="0"/>
           <w:sz w:val="21"/>
         </w:rPr>
-        <w:t>El plan contratado es:</w:t>
+        <w:t>El plan/servicio contratado es:</w:t>
       </w:r>
     </w:p>
     <w:p>
@@ -136,7 +136,7 @@
           <w:rFonts w:ascii="Calibri" w:hAnsi="Calibri"/>
           <w:sz w:val="21"/>
         </w:rPr>
-        <w:t>☐  Starter ($99.000)</w:t>
+        <w:t>☐  Starter ($79.200 — lanzamiento)</w:t>
       </w:r>
     </w:p>
     <w:p>
@@ -149,7 +149,7 @@
           <w:rFonts w:ascii="Calibri" w:hAnsi="Calibri"/>
           <w:sz w:val="21"/>
         </w:rPr>
-        <w:t>☐  Profesional ($280.000)</w:t>
+        <w:t>☐  Profesional ($224.000 — lanzamiento)</w:t>
       </w:r>
     </w:p>
     <w:p>
@@ -162,7 +162,46 @@
           <w:rFonts w:ascii="Calibri" w:hAnsi="Calibri"/>
           <w:sz w:val="21"/>
         </w:rPr>
-        <w:t>☐  Premium ($480.000)</w:t>
+        <w:t>☐  Premium ($384.000 — lanzamiento)</w:t>
+      </w:r>
+    </w:p>
+    <w:p>
+      <w:pPr>
+        <w:spacing w:after="40"/>
+        <w:ind w:left="283"/>
+      </w:pPr>
+      <w:r>
+        <w:rPr>
+          <w:rFonts w:ascii="Calibri" w:hAnsi="Calibri"/>
+          <w:sz w:val="21"/>
+        </w:rPr>
+        <w:t>☐  Analytics Setup ($44.000)</w:t>
+      </w:r>
+    </w:p>
+    <w:p>
+      <w:pPr>
+        <w:spacing w:after="40"/>
+        <w:ind w:left="283"/>
+      </w:pPr>
+      <w:r>
+        <w:rPr>
+          <w:rFonts w:ascii="Calibri" w:hAnsi="Calibri"/>
+          <w:sz w:val="21"/>
+        </w:rPr>
+        <w:t>☐  Data Pro ($152.000)</w:t>
+      </w:r>
+    </w:p>
+    <w:p>
+      <w:pPr>
+        <w:spacing w:after="40"/>
+        <w:ind w:left="283"/>
+      </w:pPr>
+      <w:r>
+        <w:rPr>
+          <w:rFonts w:ascii="Calibri" w:hAnsi="Calibri"/>
+          <w:sz w:val="21"/>
+        </w:rPr>
+        <w:t>☐  Data Enterprise (a medida)</w:t>
       </w:r>
     </w:p>
     <w:p>
@@ -218,7 +257,7 @@
           <w:i w:val="0"/>
           <w:sz w:val="21"/>
         </w:rPr>
-        <w:t>Plan Starter ($99.000):</w:t>
+        <w:t>Plan Starter ($79.200 — lanzamiento):</w:t>
       </w:r>
     </w:p>
     <w:p>
@@ -359,7 +398,7 @@
           <w:i w:val="0"/>
           <w:sz w:val="21"/>
         </w:rPr>
-        <w:t>Plan Profesional ($280.000) — incluye todo lo anterior más:</w:t>
+        <w:t>Plan Profesional ($224.000 — lanzamiento) — incluye todo lo anterior más:</w:t>
       </w:r>
     </w:p>
     <w:p>
@@ -430,7 +469,7 @@
           <w:i w:val="0"/>
           <w:sz w:val="21"/>
         </w:rPr>
-        <w:t>Plan Premium ($480.000) — incluye todo lo anterior más:</w:t>
+        <w:t>Plan Premium ($384.000 — lanzamiento) — incluye todo lo anterior más:</w:t>
       </w:r>
     </w:p>
     <w:p>
@@ -487,6 +526,262 @@
           <w:sz w:val="21"/>
         </w:rPr>
         <w:t>Formularios inteligentes con notificaciones automáticas por email</w:t>
+      </w:r>
+    </w:p>
+    <w:p>
+      <w:pPr>
+        <w:spacing w:after="120" w:line="280" w:lineRule="exact"/>
+        <w:jc w:val="both"/>
+      </w:pPr>
+      <w:r>
+        <w:rPr>
+          <w:rFonts w:ascii="Calibri" w:hAnsi="Calibri"/>
+          <w:b/>
+          <w:i w:val="0"/>
+          <w:sz w:val="21"/>
+        </w:rPr>
+        <w:t>Servicios de datos:</w:t>
+      </w:r>
+    </w:p>
+    <w:p>
+      <w:pPr>
+        <w:spacing w:after="120" w:line="280" w:lineRule="exact"/>
+        <w:jc w:val="both"/>
+      </w:pPr>
+      <w:r>
+        <w:rPr>
+          <w:rFonts w:ascii="Calibri" w:hAnsi="Calibri"/>
+          <w:b/>
+          <w:i w:val="0"/>
+          <w:sz w:val="21"/>
+        </w:rPr>
+        <w:t>Analytics Setup ($44.000):</w:t>
+      </w:r>
+    </w:p>
+    <w:p>
+      <w:pPr>
+        <w:pStyle w:val="ListBullet"/>
+        <w:spacing w:after="40"/>
+        <w:ind w:left="567"/>
+      </w:pPr>
+      <w:r>
+        <w:rPr>
+          <w:rFonts w:ascii="Calibri" w:hAnsi="Calibri"/>
+          <w:sz w:val="21"/>
+        </w:rPr>
+        <w:t>Configuración de Google Analytics 4 con eventos personalizados</w:t>
+      </w:r>
+    </w:p>
+    <w:p>
+      <w:pPr>
+        <w:pStyle w:val="ListBullet"/>
+        <w:spacing w:after="40"/>
+        <w:ind w:left="567"/>
+      </w:pPr>
+      <w:r>
+        <w:rPr>
+          <w:rFonts w:ascii="Calibri" w:hAnsi="Calibri"/>
+          <w:sz w:val="21"/>
+        </w:rPr>
+        <w:t>Dashboard básico de métricas clave</w:t>
+      </w:r>
+    </w:p>
+    <w:p>
+      <w:pPr>
+        <w:pStyle w:val="ListBullet"/>
+        <w:spacing w:after="40"/>
+        <w:ind w:left="567"/>
+      </w:pPr>
+      <w:r>
+        <w:rPr>
+          <w:rFonts w:ascii="Calibri" w:hAnsi="Calibri"/>
+          <w:sz w:val="21"/>
+        </w:rPr>
+        <w:t>Integración con Google Search Console</w:t>
+      </w:r>
+    </w:p>
+    <w:p>
+      <w:pPr>
+        <w:pStyle w:val="ListBullet"/>
+        <w:spacing w:after="40"/>
+        <w:ind w:left="567"/>
+      </w:pPr>
+      <w:r>
+        <w:rPr>
+          <w:rFonts w:ascii="Calibri" w:hAnsi="Calibri"/>
+          <w:sz w:val="21"/>
+        </w:rPr>
+        <w:t>Informe inicial de rendimiento</w:t>
+      </w:r>
+    </w:p>
+    <w:p>
+      <w:pPr>
+        <w:spacing w:after="120" w:line="280" w:lineRule="exact"/>
+        <w:jc w:val="both"/>
+      </w:pPr>
+      <w:r>
+        <w:rPr>
+          <w:rFonts w:ascii="Calibri" w:hAnsi="Calibri"/>
+          <w:b/>
+          <w:i w:val="0"/>
+          <w:sz w:val="21"/>
+        </w:rPr>
+        <w:t>Data Pro ($152.000):</w:t>
+      </w:r>
+    </w:p>
+    <w:p>
+      <w:pPr>
+        <w:pStyle w:val="ListBullet"/>
+        <w:spacing w:after="40"/>
+        <w:ind w:left="567"/>
+      </w:pPr>
+      <w:r>
+        <w:rPr>
+          <w:rFonts w:ascii="Calibri" w:hAnsi="Calibri"/>
+          <w:sz w:val="21"/>
+        </w:rPr>
+        <w:t>Todo lo de Analytics Setup</w:t>
+      </w:r>
+    </w:p>
+    <w:p>
+      <w:pPr>
+        <w:pStyle w:val="ListBullet"/>
+        <w:spacing w:after="40"/>
+        <w:ind w:left="567"/>
+      </w:pPr>
+      <w:r>
+        <w:rPr>
+          <w:rFonts w:ascii="Calibri" w:hAnsi="Calibri"/>
+          <w:sz w:val="21"/>
+        </w:rPr>
+        <w:t>Dashboard avanzado con métricas de negocio</w:t>
+      </w:r>
+    </w:p>
+    <w:p>
+      <w:pPr>
+        <w:pStyle w:val="ListBullet"/>
+        <w:spacing w:after="40"/>
+        <w:ind w:left="567"/>
+      </w:pPr>
+      <w:r>
+        <w:rPr>
+          <w:rFonts w:ascii="Calibri" w:hAnsi="Calibri"/>
+          <w:sz w:val="21"/>
+        </w:rPr>
+        <w:t>Integración de múltiples fuentes de datos</w:t>
+      </w:r>
+    </w:p>
+    <w:p>
+      <w:pPr>
+        <w:pStyle w:val="ListBullet"/>
+        <w:spacing w:after="40"/>
+        <w:ind w:left="567"/>
+      </w:pPr>
+      <w:r>
+        <w:rPr>
+          <w:rFonts w:ascii="Calibri" w:hAnsi="Calibri"/>
+          <w:sz w:val="21"/>
+        </w:rPr>
+        <w:t>Automatización de reportes periódicos</w:t>
+      </w:r>
+    </w:p>
+    <w:p>
+      <w:pPr>
+        <w:pStyle w:val="ListBullet"/>
+        <w:spacing w:after="40"/>
+        <w:ind w:left="567"/>
+      </w:pPr>
+      <w:r>
+        <w:rPr>
+          <w:rFonts w:ascii="Calibri" w:hAnsi="Calibri"/>
+          <w:sz w:val="21"/>
+        </w:rPr>
+        <w:t>Capacitación para interpretar datos</w:t>
+      </w:r>
+    </w:p>
+    <w:p>
+      <w:pPr>
+        <w:spacing w:after="120" w:line="280" w:lineRule="exact"/>
+        <w:jc w:val="both"/>
+      </w:pPr>
+      <w:r>
+        <w:rPr>
+          <w:rFonts w:ascii="Calibri" w:hAnsi="Calibri"/>
+          <w:b/>
+          <w:i w:val="0"/>
+          <w:sz w:val="21"/>
+        </w:rPr>
+        <w:t>Data Enterprise (desde $304.000 — a medida):</w:t>
+      </w:r>
+    </w:p>
+    <w:p>
+      <w:pPr>
+        <w:pStyle w:val="ListBullet"/>
+        <w:spacing w:after="40"/>
+        <w:ind w:left="567"/>
+      </w:pPr>
+      <w:r>
+        <w:rPr>
+          <w:rFonts w:ascii="Calibri" w:hAnsi="Calibri"/>
+          <w:sz w:val="21"/>
+        </w:rPr>
+        <w:t>Todo lo de Data Pro</w:t>
+      </w:r>
+    </w:p>
+    <w:p>
+      <w:pPr>
+        <w:pStyle w:val="ListBullet"/>
+        <w:spacing w:after="40"/>
+        <w:ind w:left="567"/>
+      </w:pPr>
+      <w:r>
+        <w:rPr>
+          <w:rFonts w:ascii="Calibri" w:hAnsi="Calibri"/>
+          <w:sz w:val="21"/>
+        </w:rPr>
+        <w:t>Pipelines de datos personalizados</w:t>
+      </w:r>
+    </w:p>
+    <w:p>
+      <w:pPr>
+        <w:pStyle w:val="ListBullet"/>
+        <w:spacing w:after="40"/>
+        <w:ind w:left="567"/>
+      </w:pPr>
+      <w:r>
+        <w:rPr>
+          <w:rFonts w:ascii="Calibri" w:hAnsi="Calibri"/>
+          <w:sz w:val="21"/>
+        </w:rPr>
+        <w:t>Data warehouse / data lake según necesidad</w:t>
+      </w:r>
+    </w:p>
+    <w:p>
+      <w:pPr>
+        <w:pStyle w:val="ListBullet"/>
+        <w:spacing w:after="40"/>
+        <w:ind w:left="567"/>
+      </w:pPr>
+      <w:r>
+        <w:rPr>
+          <w:rFonts w:ascii="Calibri" w:hAnsi="Calibri"/>
+          <w:sz w:val="21"/>
+        </w:rPr>
+        <w:t>Modelos predictivos y análisis avanzado</w:t>
+      </w:r>
+    </w:p>
+    <w:p>
+      <w:pPr>
+        <w:pStyle w:val="ListBullet"/>
+        <w:spacing w:after="40"/>
+        <w:ind w:left="567"/>
+      </w:pPr>
+      <w:r>
+        <w:rPr>
+          <w:rFonts w:ascii="Calibri" w:hAnsi="Calibri"/>
+          <w:sz w:val="21"/>
+        </w:rPr>
+        <w:t>Soporte continuo y mantenimiento de infraestructura de datos</w:t>
       </w:r>
     </w:p>
     <w:p>
@@ -600,20 +895,6 @@
           <w:sz w:val="21"/>
         </w:rPr>
         <w:t>Integraciones con sistemas de terceros no mencionados</w:t>
-      </w:r>
-    </w:p>
-    <w:p>
-      <w:pPr>
-        <w:pStyle w:val="ListBullet"/>
-        <w:spacing w:after="40"/>
-        <w:ind w:left="567"/>
-      </w:pPr>
-      <w:r>
-        <w:rPr>
-          <w:rFonts w:ascii="Calibri" w:hAnsi="Calibri"/>
-          <w:sz w:val="21"/>
-        </w:rPr>
-        <w:t>Servicios de ingeniería de datos (pipelines, data warehouses) — se presupuestan a medida</w:t>
       </w:r>
     </w:p>
     <w:p>
@@ -714,7 +995,7 @@
           <w:i w:val="0"/>
           <w:sz w:val="21"/>
         </w:rPr>
-        <w:t>Medios de pago aceptados: transferencia bancaria, efectivo, Mercado Pago.</w:t>
+        <w:t>3.1. Medios de pago aceptados: transferencia bancaria, efectivo, Mercado Pago.</w:t>
       </w:r>
     </w:p>
     <w:p>
@@ -729,7 +1010,7 @@
           <w:i w:val="0"/>
           <w:sz w:val="21"/>
         </w:rPr>
-        <w:t>El Desarrollador no emite factura fiscal al momento de la firma del presente contrato. Si en el futuro se inscribiera como contribuyente, podrá emitir el comprobante correspondiente. Esto no afecta la validez del presente contrato ni las obligaciones asumidas por las partes.</w:t>
+        <w:t>3.2. Stablecoins aceptadas: USDT, USDC, DAI (red Tron o Polygon).</w:t>
       </w:r>
     </w:p>
     <w:p>
@@ -744,7 +1025,52 @@
           <w:i w:val="0"/>
           <w:sz w:val="21"/>
         </w:rPr>
-        <w:t>La falta de pago en los plazos acordados habilita al Desarrollador a suspender el trabajo en curso y retener la entrega de archivos hasta su regularización.</w:t>
+        <w:t>3.3. Los pagos en criptomonedas se liquidan al tipo de cambio del momento de acreditación.</w:t>
+      </w:r>
+    </w:p>
+    <w:p>
+      <w:pPr>
+        <w:spacing w:after="120" w:line="280" w:lineRule="exact"/>
+        <w:jc w:val="both"/>
+      </w:pPr>
+      <w:r>
+        <w:rPr>
+          <w:rFonts w:ascii="Calibri" w:hAnsi="Calibri"/>
+          <w:b w:val="0"/>
+          <w:i w:val="0"/>
+          <w:sz w:val="21"/>
+        </w:rPr>
+        <w:t>3.4. El Desarrollador no emite factura fiscal al momento de la firma del presente contrato. Si en el futuro se inscribiera como contribuyente, podrá emitir el comprobante correspondiente. Esto no afecta la validez del presente contrato ni las obligaciones asumidas por las partes.</w:t>
+      </w:r>
+    </w:p>
+    <w:p>
+      <w:pPr>
+        <w:spacing w:after="120" w:line="280" w:lineRule="exact"/>
+        <w:jc w:val="both"/>
+      </w:pPr>
+      <w:r>
+        <w:rPr>
+          <w:rFonts w:ascii="Calibri" w:hAnsi="Calibri"/>
+          <w:b w:val="0"/>
+          <w:i w:val="0"/>
+          <w:sz w:val="21"/>
+        </w:rPr>
+        <w:t>3.5. La falta de pago en los plazos acordados habilita al Desarrollador a suspender el trabajo en curso y retener la entrega de archivos hasta su regularización.</w:t>
+      </w:r>
+    </w:p>
+    <w:p>
+      <w:pPr>
+        <w:spacing w:after="120" w:line="280" w:lineRule="exact"/>
+        <w:jc w:val="both"/>
+      </w:pPr>
+      <w:r>
+        <w:rPr>
+          <w:rFonts w:ascii="Calibri" w:hAnsi="Calibri"/>
+          <w:b w:val="0"/>
+          <w:i w:val="0"/>
+          <w:sz w:val="21"/>
+        </w:rPr>
+        <w:t>3.6. Los precios indicados corresponden a la promoción de lanzamiento (20% de descuento sobre precios de lista), válida para los primeros 10 clientes. Precios de lista: Starter $99.000, Profesional $280.000, Premium $480.000.</w:t>
       </w:r>
     </w:p>
     <w:p>
@@ -1855,7 +2181,7 @@
           <w:i w:val="0"/>
           <w:sz w:val="21"/>
         </w:rPr>
-        <w:t>Plan contratado:</w:t>
+        <w:t>Plan/servicio contratado:</w:t>
       </w:r>
     </w:p>
     <w:p>
@@ -1868,7 +2194,7 @@
           <w:rFonts w:ascii="Calibri" w:hAnsi="Calibri"/>
           <w:sz w:val="21"/>
         </w:rPr>
-        <w:t>☐  Starter</w:t>
+        <w:t>☐  Starter ($79.200 — lanzamiento)</w:t>
       </w:r>
     </w:p>
     <w:p>
@@ -1881,7 +2207,7 @@
           <w:rFonts w:ascii="Calibri" w:hAnsi="Calibri"/>
           <w:sz w:val="21"/>
         </w:rPr>
-        <w:t>☐  Profesional</w:t>
+        <w:t>☐  Profesional ($224.000 — lanzamiento)</w:t>
       </w:r>
     </w:p>
     <w:p>
@@ -1894,7 +2220,46 @@
           <w:rFonts w:ascii="Calibri" w:hAnsi="Calibri"/>
           <w:sz w:val="21"/>
         </w:rPr>
-        <w:t>☐  Premium</w:t>
+        <w:t>☐  Premium ($384.000 — lanzamiento)</w:t>
+      </w:r>
+    </w:p>
+    <w:p>
+      <w:pPr>
+        <w:spacing w:after="40"/>
+        <w:ind w:left="283"/>
+      </w:pPr>
+      <w:r>
+        <w:rPr>
+          <w:rFonts w:ascii="Calibri" w:hAnsi="Calibri"/>
+          <w:sz w:val="21"/>
+        </w:rPr>
+        <w:t>☐  Analytics Setup ($44.000)</w:t>
+      </w:r>
+    </w:p>
+    <w:p>
+      <w:pPr>
+        <w:spacing w:after="40"/>
+        <w:ind w:left="283"/>
+      </w:pPr>
+      <w:r>
+        <w:rPr>
+          <w:rFonts w:ascii="Calibri" w:hAnsi="Calibri"/>
+          <w:sz w:val="21"/>
+        </w:rPr>
+        <w:t>☐  Data Pro ($152.000)</w:t>
+      </w:r>
+    </w:p>
+    <w:p>
+      <w:pPr>
+        <w:spacing w:after="40"/>
+        <w:ind w:left="283"/>
+      </w:pPr>
+      <w:r>
+        <w:rPr>
+          <w:rFonts w:ascii="Calibri" w:hAnsi="Calibri"/>
+          <w:sz w:val="21"/>
+        </w:rPr>
+        <w:t>☐  Data Enterprise (a medida)</w:t>
       </w:r>
     </w:p>
     <w:p/>
@@ -1910,7 +2275,7 @@
           <w:i w:val="0"/>
           <w:sz w:val="21"/>
         </w:rPr>
-        <w:t>Descripción del sitio:</w:t>
+        <w:t>Descripción del sitio/servicio:</w:t>
       </w:r>
     </w:p>
     <w:p>
@@ -2115,6 +2480,126 @@
           <w:sz w:val="21"/>
         </w:rPr>
         <w:t>☐  Otra: ________________________________________</w:t>
+      </w:r>
+    </w:p>
+    <w:p/>
+    <w:p>
+      <w:pPr>
+        <w:spacing w:after="120" w:line="280" w:lineRule="exact"/>
+        <w:jc w:val="both"/>
+      </w:pPr>
+      <w:r>
+        <w:rPr>
+          <w:rFonts w:ascii="Calibri" w:hAnsi="Calibri"/>
+          <w:b/>
+          <w:i w:val="0"/>
+          <w:sz w:val="21"/>
+        </w:rPr>
+        <w:t>Servicios de datos:</w:t>
+      </w:r>
+    </w:p>
+    <w:p>
+      <w:pPr>
+        <w:spacing w:after="40"/>
+        <w:ind w:left="283"/>
+      </w:pPr>
+      <w:r>
+        <w:rPr>
+          <w:rFonts w:ascii="Calibri" w:hAnsi="Calibri"/>
+          <w:sz w:val="21"/>
+        </w:rPr>
+        <w:t>☐  Google Analytics 4 con eventos personalizados</w:t>
+      </w:r>
+    </w:p>
+    <w:p>
+      <w:pPr>
+        <w:spacing w:after="40"/>
+        <w:ind w:left="283"/>
+      </w:pPr>
+      <w:r>
+        <w:rPr>
+          <w:rFonts w:ascii="Calibri" w:hAnsi="Calibri"/>
+          <w:sz w:val="21"/>
+        </w:rPr>
+        <w:t>☐  Dashboard de métricas clave</w:t>
+      </w:r>
+    </w:p>
+    <w:p>
+      <w:pPr>
+        <w:spacing w:after="40"/>
+        <w:ind w:left="283"/>
+      </w:pPr>
+      <w:r>
+        <w:rPr>
+          <w:rFonts w:ascii="Calibri" w:hAnsi="Calibri"/>
+          <w:sz w:val="21"/>
+        </w:rPr>
+        <w:t>☐  Integración de múltiples fuentes de datos</w:t>
+      </w:r>
+    </w:p>
+    <w:p>
+      <w:pPr>
+        <w:spacing w:after="40"/>
+        <w:ind w:left="283"/>
+      </w:pPr>
+      <w:r>
+        <w:rPr>
+          <w:rFonts w:ascii="Calibri" w:hAnsi="Calibri"/>
+          <w:sz w:val="21"/>
+        </w:rPr>
+        <w:t>☐  Automatización de reportes</w:t>
+      </w:r>
+    </w:p>
+    <w:p>
+      <w:pPr>
+        <w:spacing w:after="40"/>
+        <w:ind w:left="283"/>
+      </w:pPr>
+      <w:r>
+        <w:rPr>
+          <w:rFonts w:ascii="Calibri" w:hAnsi="Calibri"/>
+          <w:sz w:val="21"/>
+        </w:rPr>
+        <w:t>☐  Pipelines de datos personalizados</w:t>
+      </w:r>
+    </w:p>
+    <w:p>
+      <w:pPr>
+        <w:spacing w:after="40"/>
+        <w:ind w:left="283"/>
+      </w:pPr>
+      <w:r>
+        <w:rPr>
+          <w:rFonts w:ascii="Calibri" w:hAnsi="Calibri"/>
+          <w:sz w:val="21"/>
+        </w:rPr>
+        <w:t>☐  Data warehouse / data lake</w:t>
+      </w:r>
+    </w:p>
+    <w:p>
+      <w:pPr>
+        <w:spacing w:after="40"/>
+        <w:ind w:left="283"/>
+      </w:pPr>
+      <w:r>
+        <w:rPr>
+          <w:rFonts w:ascii="Calibri" w:hAnsi="Calibri"/>
+          <w:sz w:val="21"/>
+        </w:rPr>
+        <w:t>☐  Modelos predictivos</w:t>
+      </w:r>
+    </w:p>
+    <w:p>
+      <w:pPr>
+        <w:spacing w:after="40"/>
+        <w:ind w:left="283"/>
+      </w:pPr>
+      <w:r>
+        <w:rPr>
+          <w:rFonts w:ascii="Calibri" w:hAnsi="Calibri"/>
+          <w:sz w:val="21"/>
+        </w:rPr>
+        <w:t>☐  Otro: ________________________________________</w:t>
       </w:r>
     </w:p>
     <w:p/>

</xml_diff>